<commit_message>
Contexto del cliente en BD II y nube vs on-premise en ARQ
Co-Authored-By: Claude Opus 5 <noreply@anthropic.com>
</commit_message>
<xml_diff>
--- a/Arquitectura de Sistemas Computacionales/Clases/Proyecto Integrador/Enunciado Proyecto Integrador - Arquitectura de Sistemas Computacionales - 2026-2.docx
+++ b/Arquitectura de Sistemas Computacionales/Clases/Proyecto Integrador/Enunciado Proyecto Integrador - Arquitectura de Sistemas Computacionales - 2026-2.docx
@@ -818,7 +818,7 @@
                 <w:color w:val="2B2B2B"/>
                 <w:sz w:val="20"/>
               </w:rPr>
-              <w:t>Día de parcial = solo evaluación (presencial). El paquete final cierra el domingo 15/11 23:59; el ensayo y la preparación fueron en la Sesión 10 (Clase 12)</w:t>
+              <w:t>Día de parcial = solo evaluación (virtual síncrona por Meet). El paquete final cierra el domingo 15/11 23:59; el ensayo y la preparación fueron en la Sesión 10 (Clase 12)</w:t>
             </w:r>
           </w:p>
         </w:tc>
@@ -1528,7 +1528,7 @@
           <w:color w:val="2B2B2B"/>
           <w:sz w:val="22"/>
         </w:rPr>
-        <w:t>No sustituye el Parcial 3 (09/11, presencial).</w:t>
+        <w:t>No sustituye el Parcial 3 (09/11, virtual síncrona por Meet).</w:t>
       </w:r>
     </w:p>
     <w:p>

</xml_diff>